<commit_message>
Update Bryant itinerary: revised dates (17 Mar–17 Apr), flights, 7 accommodation additions, day-20 Cromwell
</commit_message>
<xml_diff>
--- a/Bryant_Jonathan_NZ_32Days_Itinerary.docx
+++ b/Bryant_Jonathan_NZ_32Days_Itinerary.docx
@@ -298,7 +298,7 @@
                 <w:color w:val="444444"/>
                 <w:sz w:val="18"/>
               </w:rPr>
-              <w:t>Monday, 15 March 2027</w:t>
+              <w:t>Wednesday, 17 March 2027</w:t>
             </w:r>
           </w:p>
         </w:tc>
@@ -354,7 +354,7 @@
                 <w:color w:val="444444"/>
                 <w:sz w:val="18"/>
               </w:rPr>
-              <w:t>Thursday, 15 April 2027</w:t>
+              <w:t>Saturday, 17 April 2027</w:t>
             </w:r>
           </w:p>
         </w:tc>
@@ -1142,7 +1142,7 @@
                 <w:color w:val="444444"/>
                 <w:sz w:val="16"/>
               </w:rPr>
-              <w:t>Mon 15 Mar</w:t>
+              <w:t>Wed 17 Mar</w:t>
             </w:r>
           </w:p>
         </w:tc>
@@ -1196,7 +1196,7 @@
                 <w:color w:val="0B4A7A"/>
                 <w:sz w:val="17"/>
               </w:rPr>
-              <w:t>✈  Arrive Auckland International Airport – private transfer to inner-city hotel</w:t>
+              <w:t>✈  Arrive Auckland International Airport (Air NZ NZ00029, 05:45am) – private transfer to inner-city hotel</w:t>
             </w:r>
           </w:p>
           <w:p>
@@ -1509,7 +1509,7 @@
                 <w:color w:val="444444"/>
                 <w:sz w:val="16"/>
               </w:rPr>
-              <w:t>Tue 16 Mar</w:t>
+              <w:t>Thu 18 Mar</w:t>
             </w:r>
           </w:p>
         </w:tc>
@@ -1726,7 +1726,7 @@
                 <w:color w:val="444444"/>
                 <w:sz w:val="16"/>
               </w:rPr>
-              <w:t>Wed 17 Mar</w:t>
+              <w:t>Fri 19 Mar</w:t>
             </w:r>
           </w:p>
         </w:tc>
@@ -2053,7 +2053,7 @@
                 <w:color w:val="444444"/>
                 <w:sz w:val="16"/>
               </w:rPr>
-              <w:t>Thu 18 Mar</w:t>
+              <w:t>Sat 20 Mar</w:t>
             </w:r>
           </w:p>
         </w:tc>
@@ -2270,7 +2270,7 @@
                 <w:color w:val="444444"/>
                 <w:sz w:val="16"/>
               </w:rPr>
-              <w:t>Fri 19 Mar</w:t>
+              <w:t>Sun 21 Mar</w:t>
             </w:r>
           </w:p>
         </w:tc>
@@ -2637,7 +2637,7 @@
                 <w:color w:val="444444"/>
                 <w:sz w:val="16"/>
               </w:rPr>
-              <w:t>Sat 20 Mar</w:t>
+              <w:t>Mon 22 Mar</w:t>
             </w:r>
           </w:p>
         </w:tc>
@@ -2854,7 +2854,7 @@
                 <w:color w:val="444444"/>
                 <w:sz w:val="16"/>
               </w:rPr>
-              <w:t>Sun 21 Mar</w:t>
+              <w:t>Tue 23 Mar</w:t>
             </w:r>
           </w:p>
         </w:tc>
@@ -3031,7 +3031,7 @@
                 <w:color w:val="444444"/>
                 <w:sz w:val="16"/>
               </w:rPr>
-              <w:t>Mon 22 Mar</w:t>
+              <w:t>Wed 24 Mar</w:t>
             </w:r>
           </w:p>
         </w:tc>
@@ -3325,7 +3325,7 @@
                 <w:color w:val="444444"/>
                 <w:sz w:val="16"/>
               </w:rPr>
-              <w:t>Tue 23 Mar</w:t>
+              <w:t>Thu 25 Mar</w:t>
             </w:r>
           </w:p>
         </w:tc>
@@ -3502,7 +3502,7 @@
                 <w:color w:val="444444"/>
                 <w:sz w:val="16"/>
               </w:rPr>
-              <w:t>Wed 24 Mar</w:t>
+              <w:t>Fri 26 Mar</w:t>
             </w:r>
           </w:p>
         </w:tc>
@@ -3706,7 +3706,7 @@
                 <w:color w:val="444444"/>
                 <w:sz w:val="16"/>
               </w:rPr>
-              <w:t>Thu 25 Mar</w:t>
+              <w:t>Sat 27 Mar</w:t>
             </w:r>
           </w:p>
         </w:tc>
@@ -4090,7 +4090,7 @@
                 <w:color w:val="444444"/>
                 <w:sz w:val="16"/>
               </w:rPr>
-              <w:t>Fri 26 Mar</w:t>
+              <w:t>Sun 28 Mar</w:t>
             </w:r>
           </w:p>
         </w:tc>
@@ -4307,7 +4307,7 @@
                 <w:color w:val="444444"/>
                 <w:sz w:val="16"/>
               </w:rPr>
-              <w:t>Sat 27 Mar</w:t>
+              <w:t>Mon 29 Mar</w:t>
             </w:r>
           </w:p>
         </w:tc>
@@ -4524,7 +4524,7 @@
                 <w:color w:val="444444"/>
                 <w:sz w:val="16"/>
               </w:rPr>
-              <w:t>Sun 28 Mar</w:t>
+              <w:t>Tue 30 Mar</w:t>
             </w:r>
           </w:p>
         </w:tc>
@@ -4798,7 +4798,7 @@
                 <w:color w:val="444444"/>
                 <w:sz w:val="16"/>
               </w:rPr>
-              <w:t>Mon 29 Mar</w:t>
+              <w:t>Wed 31 Mar</w:t>
             </w:r>
           </w:p>
         </w:tc>
@@ -4975,7 +4975,7 @@
                 <w:color w:val="444444"/>
                 <w:sz w:val="16"/>
               </w:rPr>
-              <w:t>Tue 30 Mar</w:t>
+              <w:t>Thu 1 Apr</w:t>
             </w:r>
           </w:p>
         </w:tc>
@@ -5269,7 +5269,7 @@
                 <w:color w:val="444444"/>
                 <w:sz w:val="16"/>
               </w:rPr>
-              <w:t>Wed 31 Mar</w:t>
+              <w:t>Fri 2 Apr</w:t>
             </w:r>
           </w:p>
         </w:tc>
@@ -5446,7 +5446,7 @@
                 <w:color w:val="444444"/>
                 <w:sz w:val="16"/>
               </w:rPr>
-              <w:t>Thu 1 Apr</w:t>
+              <w:t>Sat 3 Apr</w:t>
             </w:r>
           </w:p>
         </w:tc>
@@ -5813,7 +5813,7 @@
                 <w:color w:val="444444"/>
                 <w:sz w:val="16"/>
               </w:rPr>
-              <w:t>Fri 2 Apr</w:t>
+              <w:t>Sun 4 Apr</w:t>
             </w:r>
           </w:p>
         </w:tc>
@@ -6050,7 +6050,7 @@
                 <w:color w:val="444444"/>
                 <w:sz w:val="16"/>
               </w:rPr>
-              <w:t>Sat 3 Apr</w:t>
+              <w:t>Mon 5 Apr</w:t>
             </w:r>
           </w:p>
         </w:tc>
@@ -6397,7 +6397,7 @@
                 <w:color w:val="444444"/>
                 <w:sz w:val="16"/>
               </w:rPr>
-              <w:t>Sun 4 Apr</w:t>
+              <w:t>Tue 6 Apr</w:t>
             </w:r>
           </w:p>
         </w:tc>
@@ -6614,7 +6614,7 @@
                 <w:color w:val="444444"/>
                 <w:sz w:val="16"/>
               </w:rPr>
-              <w:t>Mon 5 Apr</w:t>
+              <w:t>Wed 7 Apr</w:t>
             </w:r>
           </w:p>
         </w:tc>
@@ -6831,7 +6831,7 @@
                 <w:color w:val="444444"/>
                 <w:sz w:val="16"/>
               </w:rPr>
-              <w:t>Tue 6 Apr</w:t>
+              <w:t>Thu 8 Apr</w:t>
             </w:r>
           </w:p>
         </w:tc>
@@ -7178,7 +7178,7 @@
                 <w:color w:val="444444"/>
                 <w:sz w:val="16"/>
               </w:rPr>
-              <w:t>Wed 7 Apr</w:t>
+              <w:t>Fri 9 Apr</w:t>
             </w:r>
           </w:p>
         </w:tc>
@@ -7395,7 +7395,7 @@
                 <w:color w:val="444444"/>
                 <w:sz w:val="16"/>
               </w:rPr>
-              <w:t>Thu 8 Apr</w:t>
+              <w:t>Sat 10 Apr</w:t>
             </w:r>
           </w:p>
         </w:tc>
@@ -7632,7 +7632,7 @@
                 <w:color w:val="444444"/>
                 <w:sz w:val="16"/>
               </w:rPr>
-              <w:t>Fri 9 Apr</w:t>
+              <w:t>Sun 11 Apr</w:t>
             </w:r>
           </w:p>
         </w:tc>
@@ -7959,7 +7959,7 @@
                 <w:color w:val="444444"/>
                 <w:sz w:val="16"/>
               </w:rPr>
-              <w:t>Sat 10 Apr</w:t>
+              <w:t>Mon 12 Apr</w:t>
             </w:r>
           </w:p>
         </w:tc>
@@ -8176,7 +8176,7 @@
                 <w:color w:val="444444"/>
                 <w:sz w:val="16"/>
               </w:rPr>
-              <w:t>Sun 11 Apr</w:t>
+              <w:t>Tue 13 Apr</w:t>
             </w:r>
           </w:p>
         </w:tc>
@@ -8523,7 +8523,7 @@
                 <w:color w:val="444444"/>
                 <w:sz w:val="16"/>
               </w:rPr>
-              <w:t>Mon 12 Apr</w:t>
+              <w:t>Wed 14 Apr</w:t>
             </w:r>
           </w:p>
         </w:tc>
@@ -8760,7 +8760,7 @@
                 <w:color w:val="444444"/>
                 <w:sz w:val="16"/>
               </w:rPr>
-              <w:t>Tue 13 Apr</w:t>
+              <w:t>Thu 15 Apr</w:t>
             </w:r>
           </w:p>
         </w:tc>
@@ -9127,7 +9127,7 @@
                 <w:color w:val="444444"/>
                 <w:sz w:val="16"/>
               </w:rPr>
-              <w:t>Wed 14 Apr</w:t>
+              <w:t>Fri 16 Apr</w:t>
             </w:r>
           </w:p>
         </w:tc>
@@ -9391,7 +9391,7 @@
                 <w:color w:val="444444"/>
                 <w:sz w:val="16"/>
               </w:rPr>
-              <w:t>Thu 15 Apr</w:t>
+              <w:t>Sat 17 Apr</w:t>
             </w:r>
           </w:p>
         </w:tc>
@@ -9479,7 +9479,7 @@
                 <w:color w:val="0B4A7A"/>
                 <w:sz w:val="17"/>
               </w:rPr>
-              <w:t>✈  International Departure</w:t>
+              <w:t>✈  International Departure (Air NZ NZ00028, 07:50pm)</w:t>
             </w:r>
           </w:p>
         </w:tc>

</xml_diff>

<commit_message>
docx: sync accommodations, day-20 Cromwell, Fiordland restructure
</commit_message>
<xml_diff>
--- a/Bryant_Jonathan_NZ_32Days_Itinerary.docx
+++ b/Bryant_Jonathan_NZ_32Days_Itinerary.docx
@@ -1439,6 +1439,36 @@
               </w:r>
             </w:hyperlink>
           </w:p>
+          <w:p>
+            <w:pPr>
+              <w:ind w:left="80"/>
+              <w:jc w:val="left"/>
+              <w:spacing w:before="40" w:after="40" w:line="240" w:lineRule="auto"/>
+            </w:pPr>
+            <w:r>
+              <w:rPr>
+                <w:rFonts w:ascii="Poppins" w:hAnsi="Poppins"/>
+                <w:b/>
+                <w:i w:val="0"/>
+                <w:color w:val="0B4A7A"/>
+                <w:sz w:val="16"/>
+              </w:rPr>
+              <w:t xml:space="preserve">4★  </w:t>
+            </w:r>
+            <w:hyperlink r:id="rId143">
+              <w:r>
+                <w:rPr>
+                  <w:rStyle w:val="Hyperlink"/>
+                  <w:rFonts w:ascii="Poppins" w:hAnsi="Poppins"/>
+                  <w:sz w:val="17"/>
+                  <w:szCs w:val="17"/>
+                  <w:color w:val="444444"/>
+                  <w:u w:val="single"/>
+                </w:rPr>
+                <w:t xml:space="preserve">QT Auckland Hotel</w:t>
+              </w:r>
+            </w:hyperlink>
+          </w:p>
         </w:tc>
       </w:tr>
       <w:tr>
@@ -3255,6 +3285,36 @@
               </w:r>
             </w:hyperlink>
           </w:p>
+          <w:p>
+            <w:pPr>
+              <w:ind w:left="80"/>
+              <w:jc w:val="left"/>
+              <w:spacing w:before="40" w:after="40" w:line="240" w:lineRule="auto"/>
+            </w:pPr>
+            <w:r>
+              <w:rPr>
+                <w:rFonts w:ascii="Poppins" w:hAnsi="Poppins"/>
+                <w:b/>
+                <w:i w:val="0"/>
+                <w:color w:val="0B4A7A"/>
+                <w:sz w:val="16"/>
+              </w:rPr>
+              <w:t xml:space="preserve">4★  </w:t>
+            </w:r>
+            <w:hyperlink r:id="rId144">
+              <w:r>
+                <w:rPr>
+                  <w:rStyle w:val="Hyperlink"/>
+                  <w:rFonts w:ascii="Poppins" w:hAnsi="Poppins"/>
+                  <w:sz w:val="17"/>
+                  <w:szCs w:val="17"/>
+                  <w:color w:val="444444"/>
+                  <w:u w:val="single"/>
+                </w:rPr>
+                <w:t xml:space="preserve">Art Deco Hotel, Napier</w:t>
+              </w:r>
+            </w:hyperlink>
+          </w:p>
         </w:tc>
       </w:tr>
       <w:tr>
@@ -4728,6 +4788,66 @@
               </w:r>
             </w:hyperlink>
           </w:p>
+          <w:p>
+            <w:pPr>
+              <w:ind w:left="80"/>
+              <w:jc w:val="left"/>
+              <w:spacing w:before="40" w:after="40" w:line="240" w:lineRule="auto"/>
+            </w:pPr>
+            <w:r>
+              <w:rPr>
+                <w:rFonts w:ascii="Poppins" w:hAnsi="Poppins"/>
+                <w:b/>
+                <w:i w:val="0"/>
+                <w:color w:val="0B4A7A"/>
+                <w:sz w:val="16"/>
+              </w:rPr>
+              <w:t xml:space="preserve">4★  </w:t>
+            </w:r>
+            <w:hyperlink r:id="rId145">
+              <w:r>
+                <w:rPr>
+                  <w:rStyle w:val="Hyperlink"/>
+                  <w:rFonts w:ascii="Poppins" w:hAnsi="Poppins"/>
+                  <w:sz w:val="17"/>
+                  <w:szCs w:val="17"/>
+                  <w:color w:val="444444"/>
+                  <w:u w:val="single"/>
+                </w:rPr>
+                <w:t xml:space="preserve">14th Lane Urban Hotel</w:t>
+              </w:r>
+            </w:hyperlink>
+          </w:p>
+          <w:p>
+            <w:pPr>
+              <w:ind w:left="80"/>
+              <w:jc w:val="left"/>
+              <w:spacing w:before="40" w:after="40" w:line="240" w:lineRule="auto"/>
+            </w:pPr>
+            <w:r>
+              <w:rPr>
+                <w:rFonts w:ascii="Poppins" w:hAnsi="Poppins"/>
+                <w:b/>
+                <w:i w:val="0"/>
+                <w:color w:val="0B4A7A"/>
+                <w:sz w:val="16"/>
+              </w:rPr>
+              <w:t xml:space="preserve">5★  </w:t>
+            </w:r>
+            <w:hyperlink r:id="rId146">
+              <w:r>
+                <w:rPr>
+                  <w:rStyle w:val="Hyperlink"/>
+                  <w:rFonts w:ascii="Poppins" w:hAnsi="Poppins"/>
+                  <w:sz w:val="17"/>
+                  <w:szCs w:val="17"/>
+                  <w:color w:val="444444"/>
+                  <w:u w:val="single"/>
+                </w:rPr>
+                <w:t xml:space="preserve">Marlborough Lodge</w:t>
+              </w:r>
+            </w:hyperlink>
+          </w:p>
         </w:tc>
       </w:tr>
       <w:tr>
@@ -5743,6 +5863,36 @@
               </w:r>
             </w:hyperlink>
           </w:p>
+          <w:p>
+            <w:pPr>
+              <w:ind w:left="80"/>
+              <w:jc w:val="left"/>
+              <w:spacing w:before="40" w:after="40" w:line="240" w:lineRule="auto"/>
+            </w:pPr>
+            <w:r>
+              <w:rPr>
+                <w:rFonts w:ascii="Poppins" w:hAnsi="Poppins"/>
+                <w:b/>
+                <w:i w:val="0"/>
+                <w:color w:val="0B4A7A"/>
+                <w:sz w:val="16"/>
+              </w:rPr>
+              <w:t xml:space="preserve">4★  </w:t>
+            </w:r>
+            <w:hyperlink r:id="rId147">
+              <w:r>
+                <w:rPr>
+                  <w:rStyle w:val="Hyperlink"/>
+                  <w:rFonts w:ascii="Poppins" w:hAnsi="Poppins"/>
+                  <w:sz w:val="17"/>
+                  <w:szCs w:val="17"/>
+                  <w:color w:val="444444"/>
+                  <w:u w:val="single"/>
+                </w:rPr>
+                <w:t xml:space="preserve">Te Wa Whakatā Ōkārito</w:t>
+              </w:r>
+            </w:hyperlink>
+          </w:p>
         </w:tc>
       </w:tr>
       <w:tr>
@@ -6323,7 +6473,7 @@
                   <w:color w:val="444444"/>
                   <w:u w:val="single"/>
                 </w:rPr>
-                <w:t xml:space="preserve">Mt. Michael Lodge (Cromwell / Central Otago)</w:t>
+                <w:t xml:space="preserve">Mt. Michael Lodge (Cromwell / Central Otago) — Day 20 confirmed stay</w:t>
               </w:r>
             </w:hyperlink>
           </w:p>
@@ -6814,7 +6964,7 @@
                 <w:color w:val="0B4A7A"/>
                 <w:sz w:val="18"/>
               </w:rPr>
-              <w:t>Wanaka → Te Anau (via Queenstown)</w:t>
+              <w:t>Wanaka → Doubtful Sound Overnight Cruise (via Queenstown) — overnight aboard 8 Apr, return midday 9 Apr; then 2 nights in Te Anau</w:t>
             </w:r>
           </w:p>
           <w:p>
@@ -7378,7 +7528,7 @@
                 <w:color w:val="0B4A7A"/>
                 <w:sz w:val="18"/>
               </w:rPr>
-              <w:t>Fiordland – Doubtful Sound &amp; Kepler</w:t>
+              <w:t>Te Anau – Fiordland at Leisure (Kepler &amp; Glowworms)</w:t>
             </w:r>
           </w:p>
           <w:p>
@@ -8453,6 +8603,36 @@
               </w:r>
             </w:hyperlink>
           </w:p>
+          <w:p>
+            <w:pPr>
+              <w:ind w:left="80"/>
+              <w:jc w:val="left"/>
+              <w:spacing w:before="40" w:after="40" w:line="240" w:lineRule="auto"/>
+            </w:pPr>
+            <w:r>
+              <w:rPr>
+                <w:rFonts w:ascii="Poppins" w:hAnsi="Poppins"/>
+                <w:b/>
+                <w:i w:val="0"/>
+                <w:color w:val="0B4A7A"/>
+                <w:sz w:val="16"/>
+              </w:rPr>
+              <w:t xml:space="preserve">4★  </w:t>
+            </w:r>
+            <w:hyperlink r:id="rId148">
+              <w:r>
+                <w:rPr>
+                  <w:rStyle w:val="Hyperlink"/>
+                  <w:rFonts w:ascii="Poppins" w:hAnsi="Poppins"/>
+                  <w:sz w:val="17"/>
+                  <w:szCs w:val="17"/>
+                  <w:color w:val="444444"/>
+                  <w:u w:val="single"/>
+                </w:rPr>
+                <w:t xml:space="preserve">Nightsky Cottage, Twizel</w:t>
+              </w:r>
+            </w:hyperlink>
+          </w:p>
         </w:tc>
       </w:tr>
       <w:tr>
@@ -9054,6 +9234,36 @@
                   <w:u w:val="single"/>
                 </w:rPr>
                 <w:t xml:space="preserve">The George Hotel</w:t>
+              </w:r>
+            </w:hyperlink>
+          </w:p>
+          <w:p>
+            <w:pPr>
+              <w:ind w:left="80"/>
+              <w:jc w:val="left"/>
+              <w:spacing w:before="40" w:after="40" w:line="240" w:lineRule="auto"/>
+            </w:pPr>
+            <w:r>
+              <w:rPr>
+                <w:rFonts w:ascii="Poppins" w:hAnsi="Poppins"/>
+                <w:b/>
+                <w:i w:val="0"/>
+                <w:color w:val="0B4A7A"/>
+                <w:sz w:val="16"/>
+              </w:rPr>
+              <w:t xml:space="preserve">4★  </w:t>
+            </w:r>
+            <w:hyperlink r:id="rId149">
+              <w:r>
+                <w:rPr>
+                  <w:rStyle w:val="Hyperlink"/>
+                  <w:rFonts w:ascii="Poppins" w:hAnsi="Poppins"/>
+                  <w:sz w:val="17"/>
+                  <w:szCs w:val="17"/>
+                  <w:color w:val="444444"/>
+                  <w:u w:val="single"/>
+                </w:rPr>
+                <w:t xml:space="preserve">Mayfair Hotel Christchurch</w:t>
               </w:r>
             </w:hyperlink>
           </w:p>

</xml_diff>